<commit_message>
docs: update frozen guideline
</commit_message>
<xml_diff>
--- a/target-dotnet/docs/SESS_ERP_Stores_Full_Schema_Guideline.docx
+++ b/target-dotnet/docs/SESS_ERP_Stores_Full_Schema_Guideline.docx
@@ -212,17 +212,8 @@
             </w:tcMar>
           </w:tcPr>
           <w:p>
-            <w:pPr>
-              <w:spacing w:after="0" w:line="240" w:lineRule="auto"/>
-            </w:pPr>
-            <w:r/>
-            <w:r>
-              <w:rPr>
-                <w:rFonts w:ascii="Aptos" w:hAnsi="Aptos"/>
-                <w:b w:val="0"/>
-                <w:sz w:val="18"/>
-              </w:rPr>
-              <w:t xml:space="preserve">Frozen baseline - 12 contradictions and Batches 1-4 confirmed</w:t>
+            <w:r>
+              <w:t>Frozen baseline - 12 contradictions, Batches 1-4 and seven requirement-conflict rulings confirmed</w:t>
             </w:r>
           </w:p>
         </w:tc>
@@ -271,17 +262,8 @@
             <w:shd w:fill="EEF5F9"/>
           </w:tcPr>
           <w:p>
-            <w:pPr>
-              <w:spacing w:after="0" w:line="240" w:lineRule="auto"/>
-            </w:pPr>
-            <w:r/>
-            <w:r>
-              <w:rPr>
-                <w:rFonts w:ascii="Aptos" w:hAnsi="Aptos"/>
-                <w:b w:val="0"/>
-                <w:sz w:val="18"/>
-              </w:rPr>
-              <w:t xml:space="preserve">1.5 - Batch 4 stock exceptions, counting and disposal frozen</w:t>
+            <w:r>
+              <w:t>1.6 - Seven requirement conflicts frozen; guideline precedence confirmed</w:t>
             </w:r>
           </w:p>
         </w:tc>
@@ -2596,6 +2578,463 @@
         </w:tc>
       </w:tr>
     </w:tbl>
+    <w:p>
+      <w:pPr>
+        <w:pStyle w:val="Heading2"/>
+      </w:pPr>
+      <w:r>
+        <w:t>2.1 Governing Precedence and Final Requirement-Conflict Rulings</w:t>
+      </w:r>
+    </w:p>
+    <w:p>
+      <w:r>
+        <w:rPr>
+          <w:b/>
+        </w:rPr>
+        <w:t xml:space="preserve">Governing rule. </w:t>
+      </w:r>
+      <w:r>
+        <w:t>Where SESS_ERP_Purchase_Store_Complete_Requirement.docx and this guideline disagree, this guideline governs. The seven rulings below preserve the frozen live behavior. They may be changed only through the approved change-control and impact-note process; a newer narrative requirement does not override them silently.</w:t>
+      </w:r>
+    </w:p>
+    <w:tbl>
+      <w:tblPr>
+        <w:tblStyle w:val="TableGrid"/>
+        <w:tblW w:type="dxa" w:w="10224"/>
+        <w:tblLayout w:type="fixed"/>
+        <w:tblLook w:firstColumn="1" w:firstRow="1" w:lastColumn="0" w:lastRow="0" w:noHBand="0" w:noVBand="1" w:val="04A0"/>
+        <w:tblInd w:w="120" w:type="dxa"/>
+      </w:tblPr>
+      <w:tblGrid>
+        <w:gridCol w:w="1500"/>
+        <w:gridCol w:w="4200"/>
+        <w:gridCol w:w="4524"/>
+      </w:tblGrid>
+      <w:tr>
+        <w:tc>
+          <w:tcPr>
+            <w:tcW w:type="dxa" w:w="1500"/>
+          </w:tcPr>
+          <w:p>
+            <w:pPr>
+              <w:spacing w:after="40"/>
+              <w:jc w:val="left"/>
+            </w:pPr>
+            <w:r>
+              <w:rPr>
+                <w:b/>
+                <w:sz w:val="17"/>
+              </w:rPr>
+              <w:t>Decision</w:t>
+            </w:r>
+          </w:p>
+        </w:tc>
+        <w:tc>
+          <w:tcPr>
+            <w:tcW w:type="dxa" w:w="4200"/>
+          </w:tcPr>
+          <w:p>
+            <w:pPr>
+              <w:spacing w:after="40"/>
+              <w:jc w:val="left"/>
+            </w:pPr>
+            <w:r>
+              <w:rPr>
+                <w:b/>
+                <w:sz w:val="17"/>
+              </w:rPr>
+              <w:t>Governing frozen behavior</w:t>
+            </w:r>
+          </w:p>
+        </w:tc>
+        <w:tc>
+          <w:tcPr>
+            <w:tcW w:type="dxa" w:w="4524"/>
+          </w:tcPr>
+          <w:p>
+            <w:pPr>
+              <w:spacing w:after="40"/>
+              <w:jc w:val="left"/>
+            </w:pPr>
+            <w:r>
+              <w:rPr>
+                <w:b/>
+                <w:sz w:val="17"/>
+              </w:rPr>
+              <w:t>Implementation consequence</w:t>
+            </w:r>
+          </w:p>
+        </w:tc>
+      </w:tr>
+      <w:tr>
+        <w:tc>
+          <w:tcPr>
+            <w:tcW w:type="dxa" w:w="1500"/>
+          </w:tcPr>
+          <w:p>
+            <w:pPr>
+              <w:spacing w:after="40"/>
+            </w:pPr>
+            <w:r>
+              <w:rPr>
+                <w:b/>
+                <w:sz w:val="17"/>
+              </w:rPr>
+              <w:t>1. Approval thresholds</w:t>
+            </w:r>
+          </w:p>
+        </w:tc>
+        <w:tc>
+          <w:tcPr>
+            <w:tcW w:type="dxa" w:w="4200"/>
+          </w:tcPr>
+          <w:p>
+            <w:pPr>
+              <w:spacing w:after="40"/>
+            </w:pPr>
+            <w:r>
+              <w:rPr>
+                <w:sz w:val="17"/>
+              </w:rPr>
+              <w:t>The live bands remain below 5,000: department-mapped manager; 5,000 through 100,000: department manager then TECHNICAL_DIRECTOR; above 100,000: department manager then MANAGING_DIRECTOR.</w:t>
+            </w:r>
+          </w:p>
+        </w:tc>
+        <w:tc>
+          <w:tcPr>
+            <w:tcW w:type="dxa" w:w="4524"/>
+          </w:tcPr>
+          <w:p>
+            <w:pPr>
+              <w:spacing w:after="40"/>
+            </w:pPr>
+            <w:r>
+              <w:rPr>
+                <w:sz w:val="17"/>
+              </w:rPr>
+              <w:t>Thresholds are company-scoped configuration data and may later change by governed effective-dated data, not by business-logic code. Missing or ambiguous configuration must fail closed. Existing document-cycle snapshots remain immutable.</w:t>
+            </w:r>
+          </w:p>
+        </w:tc>
+      </w:tr>
+      <w:tr>
+        <w:tc>
+          <w:tcPr>
+            <w:tcW w:type="dxa" w:w="1500"/>
+          </w:tcPr>
+          <w:p>
+            <w:pPr>
+              <w:spacing w:after="40"/>
+            </w:pPr>
+            <w:r>
+              <w:rPr>
+                <w:b/>
+                <w:sz w:val="17"/>
+              </w:rPr>
+              <w:t>2. Valuation</w:t>
+            </w:r>
+          </w:p>
+        </w:tc>
+        <w:tc>
+          <w:tcPr>
+            <w:tcW w:type="dxa" w:w="4200"/>
+          </w:tcPr>
+          <w:p>
+            <w:pPr>
+              <w:spacing w:after="40"/>
+            </w:pPr>
+            <w:r>
+              <w:rPr>
+                <w:sz w:val="17"/>
+              </w:rPr>
+              <w:t>Inventory valuation is strict FIFO within company, Item and the applicable ownership/value pool. Weighted average is not used.</w:t>
+            </w:r>
+          </w:p>
+        </w:tc>
+        <w:tc>
+          <w:tcPr>
+            <w:tcW w:type="dxa" w:w="4524"/>
+          </w:tcPr>
+          <w:p>
+            <w:pPr>
+              <w:spacing w:after="40"/>
+            </w:pPr>
+            <w:r>
+              <w:rPr>
+                <w:sz w:val="17"/>
+              </w:rPr>
+              <w:t>Do not create a weighted-average track or a third accounting valuation track. Accepted vendor-bill allocation remains the separate Actual BOM cost basis already frozen in this guideline.</w:t>
+            </w:r>
+          </w:p>
+        </w:tc>
+      </w:tr>
+      <w:tr>
+        <w:tc>
+          <w:tcPr>
+            <w:tcW w:type="dxa" w:w="1500"/>
+          </w:tcPr>
+          <w:p>
+            <w:pPr>
+              <w:spacing w:after="40"/>
+            </w:pPr>
+            <w:r>
+              <w:rPr>
+                <w:b/>
+                <w:sz w:val="17"/>
+              </w:rPr>
+              <w:t>3. QC disposition</w:t>
+            </w:r>
+          </w:p>
+        </w:tc>
+        <w:tc>
+          <w:tcPr>
+            <w:tcW w:type="dxa" w:w="4200"/>
+          </w:tcPr>
+          <w:p>
+            <w:pPr>
+              <w:spacing w:after="40"/>
+            </w:pPr>
+            <w:r>
+              <w:rPr>
+                <w:sz w:val="17"/>
+              </w:rPr>
+              <w:t>Final QC disposition is Accepted or Rejected only. QC_HOLD remains pending physical custody and is not a final inspection decision.</w:t>
+            </w:r>
+          </w:p>
+        </w:tc>
+        <w:tc>
+          <w:tcPr>
+            <w:tcW w:type="dxa" w:w="4524"/>
+          </w:tcPr>
+          <w:p>
+            <w:pPr>
+              <w:spacing w:after="40"/>
+            </w:pPr>
+            <w:r>
+              <w:rPr>
+                <w:sz w:val="17"/>
+              </w:rPr>
+              <w:t>A use-as-is concession is the one Conditional Acceptance control: it may be raised only after a recorded rejection and requires the frozen direct TECHNICAL_DIRECTOR approval. Do not build a second Conditional Acceptance workflow.</w:t>
+            </w:r>
+          </w:p>
+        </w:tc>
+      </w:tr>
+      <w:tr>
+        <w:tc>
+          <w:tcPr>
+            <w:tcW w:type="dxa" w:w="1500"/>
+          </w:tcPr>
+          <w:p>
+            <w:pPr>
+              <w:spacing w:after="40"/>
+            </w:pPr>
+            <w:r>
+              <w:rPr>
+                <w:b/>
+                <w:sz w:val="17"/>
+              </w:rPr>
+              <w:t>4. Negative stock</w:t>
+            </w:r>
+          </w:p>
+        </w:tc>
+        <w:tc>
+          <w:tcPr>
+            <w:tcW w:type="dxa" w:w="4200"/>
+          </w:tcPr>
+          <w:p>
+            <w:pPr>
+              <w:spacing w:after="40"/>
+            </w:pPr>
+            <w:r>
+              <w:rPr>
+                <w:sz w:val="17"/>
+              </w:rPr>
+              <w:t>Negative AVAILABLE stock is forbidden without exception.</w:t>
+            </w:r>
+          </w:p>
+        </w:tc>
+        <w:tc>
+          <w:tcPr>
+            <w:tcW w:type="dxa" w:w="4524"/>
+          </w:tcPr>
+          <w:p>
+            <w:pPr>
+              <w:spacing w:after="40"/>
+            </w:pPr>
+            <w:r>
+              <w:rPr>
+                <w:sz w:val="17"/>
+              </w:rPr>
+              <w:t>Do not create an override record, override permission or override parameter in the controlled posting function. Urgency uses available stock, approved transfer/substitute or receipt.</w:t>
+            </w:r>
+          </w:p>
+        </w:tc>
+      </w:tr>
+      <w:tr>
+        <w:tc>
+          <w:tcPr>
+            <w:tcW w:type="dxa" w:w="1500"/>
+          </w:tcPr>
+          <w:p>
+            <w:pPr>
+              <w:spacing w:after="40"/>
+            </w:pPr>
+            <w:r>
+              <w:rPr>
+                <w:b/>
+                <w:sz w:val="17"/>
+              </w:rPr>
+              <w:t>5. Excess issue beyond BOM</w:t>
+            </w:r>
+          </w:p>
+        </w:tc>
+        <w:tc>
+          <w:tcPr>
+            <w:tcW w:type="dxa" w:w="4200"/>
+          </w:tcPr>
+          <w:p>
+            <w:pPr>
+              <w:spacing w:after="40"/>
+            </w:pPr>
+            <w:r>
+              <w:rPr>
+                <w:sz w:val="17"/>
+              </w:rPr>
+              <w:t>For internal chamber assembly, approved issue of extra quantity of the same Item remains allowed and generates the frozen durable notifications; it is not blocked and needs no deviation approval.</w:t>
+            </w:r>
+          </w:p>
+        </w:tc>
+        <w:tc>
+          <w:tcPr>
+            <w:tcW w:type="dxa" w:w="4524"/>
+          </w:tcPr>
+          <w:p>
+            <w:pPr>
+              <w:spacing w:after="40"/>
+            </w:pPr>
+            <w:r>
+              <w:rPr>
+                <w:sz w:val="17"/>
+              </w:rPr>
+              <w:t>Correct conflicting requirements text, not the posting behavior. Different-Item substitution and customer-facing extra material retain their separately frozen approval rules.</w:t>
+            </w:r>
+          </w:p>
+        </w:tc>
+      </w:tr>
+      <w:tr>
+        <w:tc>
+          <w:tcPr>
+            <w:tcW w:type="dxa" w:w="1500"/>
+          </w:tcPr>
+          <w:p>
+            <w:pPr>
+              <w:spacing w:after="40"/>
+            </w:pPr>
+            <w:r>
+              <w:rPr>
+                <w:b/>
+                <w:sz w:val="17"/>
+              </w:rPr>
+              <w:t>6. Authentication</w:t>
+            </w:r>
+          </w:p>
+        </w:tc>
+        <w:tc>
+          <w:tcPr>
+            <w:tcW w:type="dxa" w:w="4200"/>
+          </w:tcPr>
+          <w:p>
+            <w:pPr>
+              <w:spacing w:after="40"/>
+            </w:pPr>
+            <w:r>
+              <w:rPr>
+                <w:sz w:val="17"/>
+              </w:rPr>
+              <w:t>Authentication remains standards-compliant OIDC only. Password policy, first-login reset, lockout and MFA are provider controls; ERP stores no local password credential.</w:t>
+            </w:r>
+          </w:p>
+        </w:tc>
+        <w:tc>
+          <w:tcPr>
+            <w:tcW w:type="dxa" w:w="4524"/>
+          </w:tcPr>
+          <w:p>
+            <w:pPr>
+              <w:spacing w:after="40"/>
+            </w:pPr>
+            <w:r>
+              <w:rPr>
+                <w:sz w:val="17"/>
+              </w:rPr>
+              <w:t>Employee code may be the provider username, while issuer plus subject remains the durable identity key. Active-session listing requires an ERP session registry or standards-compliant provider integration and is now a tracked requirement. Provider role/group claims never grant ERP authorization.</w:t>
+            </w:r>
+          </w:p>
+        </w:tc>
+      </w:tr>
+      <w:tr>
+        <w:tc>
+          <w:tcPr>
+            <w:tcW w:type="dxa" w:w="1500"/>
+          </w:tcPr>
+          <w:p>
+            <w:pPr>
+              <w:spacing w:after="40"/>
+            </w:pPr>
+            <w:r>
+              <w:rPr>
+                <w:b/>
+                <w:sz w:val="17"/>
+              </w:rPr>
+              <w:t>7. Source-code handover</w:t>
+            </w:r>
+          </w:p>
+        </w:tc>
+        <w:tc>
+          <w:tcPr>
+            <w:tcW w:type="dxa" w:w="4200"/>
+          </w:tcPr>
+          <w:p>
+            <w:pPr>
+              <w:spacing w:after="40"/>
+            </w:pPr>
+            <w:r>
+              <w:rPr>
+                <w:sz w:val="17"/>
+              </w:rPr>
+              <w:t>Full source/build/configuration handover is project governance and acceptance evidence, not ERP product behavior.</w:t>
+            </w:r>
+          </w:p>
+        </w:tc>
+        <w:tc>
+          <w:tcPr>
+            <w:tcW w:type="dxa" w:w="4524"/>
+          </w:tcPr>
+          <w:p>
+            <w:pPr>
+              <w:spacing w:after="40"/>
+            </w:pPr>
+            <w:r>
+              <w:rPr>
+                <w:sz w:val="17"/>
+              </w:rPr>
+              <w:t>Retain repository, build, migration, configuration, deployment and recovery documentation. Do not create schema, API or workflow behavior solely for external-supplier handover language.</w:t>
+            </w:r>
+          </w:p>
+        </w:tc>
+      </w:tr>
+    </w:tbl>
+    <w:p>
+      <w:r>
+        <w:rPr>
+          <w:b/>
+        </w:rPr>
+        <w:t xml:space="preserve">Implementation conformance finding. </w:t>
+      </w:r>
+      <w:r>
+        <w:t>PurchaseRequisitionEndpointHelpers currently contains runtime fallback arrays using 50,000 and 500,000 when no route-setting rows exist. Those fallbacks do not conform to this frozen rule. They must not be treated as approved defaults: runtime approval resolution must use active configured rows and fail closed when configuration is absent or ambiguous.</w:t>
+      </w:r>
+    </w:p>
     <w:p>
       <w:pPr>
         <w:spacing w:before="120" w:after="60"/>

</xml_diff>